<commit_message>
Update research report document
</commit_message>
<xml_diff>
--- a/assets/同类开源方案调研报告.docx
+++ b/assets/同类开源方案调研报告.docx
@@ -10523,21 +10523,1190 @@
     <w:p>
       <w:pPr>
         <w:spacing w:line="360" w:lineRule="auto"/>
-      </w:pPr>
-      <w:r>
         <w:rPr>
           <w:sz w:val="20"/>
         </w:rPr>
-        <w:t>Ragas GitHub：https://github.com/vibrantlabsai/ragas</w:t>
+      </w:pPr>
+      <w:r>
+        <w:rPr>
+          <w:sz w:val="20"/>
+        </w:rPr>
+        <w:t>Ragas GitHub：</w:t>
+      </w:r>
+      <w:hyperlink r:id="rId8" w:history="1">
+        <w:r>
+          <w:rPr>
+            <w:rStyle w:val="aff9"/>
+            <w:sz w:val="20"/>
+          </w:rPr>
+          <w:t>https://github.com/vibrantlabsai/ragas</w:t>
+        </w:r>
+      </w:hyperlink>
+    </w:p>
+    <w:p>
+      <w:pPr>
+        <w:spacing w:line="360" w:lineRule="auto"/>
+        <w:rPr>
+          <w:lang w:eastAsia="zh-CN"/>
+        </w:rPr>
+      </w:pPr>
+      <w:r>
+        <w:rPr>
+          <w:lang w:eastAsia="zh-CN"/>
+        </w:rPr>
+        <w:t xml:space="preserve">  - </w:t>
+      </w:r>
+      <w:proofErr w:type="spellStart"/>
+      <w:r>
+        <w:rPr>
+          <w:lang w:eastAsia="zh-CN"/>
+        </w:rPr>
+        <w:t>RepoCoder</w:t>
+      </w:r>
+      <w:proofErr w:type="spellEnd"/>
+      <w:r>
+        <w:rPr>
+          <w:lang w:eastAsia="zh-CN"/>
+        </w:rPr>
+        <w:t xml:space="preserve">：GitHub 在 </w:t>
+      </w:r>
+      <w:proofErr w:type="spellStart"/>
+      <w:r>
+        <w:rPr>
+          <w:lang w:eastAsia="zh-CN"/>
+        </w:rPr>
+        <w:t>microsoft</w:t>
+      </w:r>
+      <w:proofErr w:type="spellEnd"/>
+      <w:r>
+        <w:rPr>
+          <w:lang w:eastAsia="zh-CN"/>
+        </w:rPr>
+        <w:t>/</w:t>
+      </w:r>
+      <w:proofErr w:type="spellStart"/>
+      <w:r>
+        <w:rPr>
+          <w:lang w:eastAsia="zh-CN"/>
+        </w:rPr>
+        <w:t>CodeT</w:t>
+      </w:r>
+      <w:proofErr w:type="spellEnd"/>
+      <w:r>
+        <w:rPr>
+          <w:lang w:eastAsia="zh-CN"/>
+        </w:rPr>
+        <w:t>/tree/main/</w:t>
+      </w:r>
+      <w:proofErr w:type="spellStart"/>
+      <w:r>
+        <w:rPr>
+          <w:lang w:eastAsia="zh-CN"/>
+        </w:rPr>
+        <w:t>RepoCoder</w:t>
+      </w:r>
+      <w:proofErr w:type="spellEnd"/>
+    </w:p>
+    <w:p>
+      <w:pPr>
+        <w:spacing w:line="360" w:lineRule="auto"/>
+        <w:rPr>
+          <w:lang w:eastAsia="zh-CN"/>
+        </w:rPr>
+      </w:pPr>
+      <w:r>
+        <w:rPr>
+          <w:lang w:eastAsia="zh-CN"/>
+        </w:rPr>
+        <w:lastRenderedPageBreak/>
+        <w:t xml:space="preserve">    (https://github.com/microsoft/CodeT/tree/main/RepoCoder)，论文是 </w:t>
+      </w:r>
+      <w:proofErr w:type="spellStart"/>
+      <w:r>
+        <w:rPr>
+          <w:lang w:eastAsia="zh-CN"/>
+        </w:rPr>
+        <w:t>RepoCoder</w:t>
+      </w:r>
+      <w:proofErr w:type="spellEnd"/>
+    </w:p>
+    <w:p>
+      <w:pPr>
+        <w:spacing w:line="360" w:lineRule="auto"/>
+        <w:rPr>
+          <w:lang w:eastAsia="zh-CN"/>
+        </w:rPr>
+      </w:pPr>
+      <w:r>
+        <w:rPr>
+          <w:lang w:eastAsia="zh-CN"/>
+        </w:rPr>
+        <w:t xml:space="preserve">    (https://arxiv.org/abs/2303.12570)。它用的核心数据集是 </w:t>
+      </w:r>
+      <w:proofErr w:type="spellStart"/>
+      <w:r>
+        <w:rPr>
+          <w:lang w:eastAsia="zh-CN"/>
+        </w:rPr>
+        <w:t>RepoEval</w:t>
+      </w:r>
+      <w:proofErr w:type="spellEnd"/>
+      <w:r>
+        <w:rPr>
+          <w:lang w:eastAsia="zh-CN"/>
+        </w:rPr>
+        <w:t>，来自 2022 年后创建的真实 GitHub Python</w:t>
+      </w:r>
+    </w:p>
+    <w:p>
+      <w:pPr>
+        <w:spacing w:line="360" w:lineRule="auto"/>
+        <w:rPr>
+          <w:lang w:eastAsia="zh-CN"/>
+        </w:rPr>
+      </w:pPr>
+      <w:r>
+        <w:rPr>
+          <w:lang w:eastAsia="zh-CN"/>
+        </w:rPr>
+        <w:t xml:space="preserve">    仓库，覆盖 line、API invocation、function body</w:t>
+      </w:r>
+    </w:p>
+    <w:p>
+      <w:pPr>
+        <w:spacing w:line="360" w:lineRule="auto"/>
+        <w:rPr>
+          <w:lang w:eastAsia="zh-CN"/>
+        </w:rPr>
+      </w:pPr>
+      <w:r>
+        <w:rPr>
+          <w:lang w:eastAsia="zh-CN"/>
+        </w:rPr>
+        <w:t xml:space="preserve">    三种粒度，并且用仓库里的单元测试做评测。这个最像你现在要做的“结构化切分 + 检索效果评估”。</w:t>
+      </w:r>
+    </w:p>
+    <w:p>
+      <w:pPr>
+        <w:spacing w:line="360" w:lineRule="auto"/>
+        <w:rPr>
+          <w:lang w:eastAsia="zh-CN"/>
+        </w:rPr>
+      </w:pPr>
+    </w:p>
+    <w:p>
+      <w:pPr>
+        <w:spacing w:line="360" w:lineRule="auto"/>
+        <w:rPr>
+          <w:lang w:eastAsia="zh-CN"/>
+        </w:rPr>
+      </w:pPr>
+      <w:r>
+        <w:rPr>
+          <w:lang w:eastAsia="zh-CN"/>
+        </w:rPr>
+        <w:t xml:space="preserve">  - </w:t>
+      </w:r>
+      <w:proofErr w:type="spellStart"/>
+      <w:r>
+        <w:rPr>
+          <w:lang w:eastAsia="zh-CN"/>
+        </w:rPr>
+        <w:t>RLCoder</w:t>
+      </w:r>
+      <w:proofErr w:type="spellEnd"/>
+      <w:r>
+        <w:rPr>
+          <w:lang w:eastAsia="zh-CN"/>
+        </w:rPr>
+        <w:t xml:space="preserve">：GitHub 在 </w:t>
+      </w:r>
+      <w:proofErr w:type="spellStart"/>
+      <w:r>
+        <w:rPr>
+          <w:lang w:eastAsia="zh-CN"/>
+        </w:rPr>
+        <w:t>DeepSoftwareAnalytics</w:t>
+      </w:r>
+      <w:proofErr w:type="spellEnd"/>
+      <w:r>
+        <w:rPr>
+          <w:lang w:eastAsia="zh-CN"/>
+        </w:rPr>
+        <w:t>/</w:t>
+      </w:r>
+      <w:proofErr w:type="spellStart"/>
+      <w:r>
+        <w:rPr>
+          <w:lang w:eastAsia="zh-CN"/>
+        </w:rPr>
+        <w:t>RLCoder</w:t>
+      </w:r>
+      <w:proofErr w:type="spellEnd"/>
+      <w:r>
+        <w:rPr>
+          <w:lang w:eastAsia="zh-CN"/>
+        </w:rPr>
+        <w:t xml:space="preserve"> (https://github.com/DeepSoftwareAnalytics/RLCoder)，论文是</w:t>
+      </w:r>
+    </w:p>
+    <w:p>
+      <w:pPr>
+        <w:spacing w:line="360" w:lineRule="auto"/>
+        <w:rPr>
+          <w:lang w:eastAsia="zh-CN"/>
+        </w:rPr>
+      </w:pPr>
+      <w:r>
+        <w:rPr>
+          <w:lang w:eastAsia="zh-CN"/>
+        </w:rPr>
+        <w:t xml:space="preserve">    </w:t>
+      </w:r>
+      <w:proofErr w:type="spellStart"/>
+      <w:r>
+        <w:rPr>
+          <w:lang w:eastAsia="zh-CN"/>
+        </w:rPr>
+        <w:t>RLCoder</w:t>
+      </w:r>
+      <w:proofErr w:type="spellEnd"/>
+      <w:r>
+        <w:rPr>
+          <w:lang w:eastAsia="zh-CN"/>
+        </w:rPr>
+        <w:t xml:space="preserve"> (https://arxiv.org/abs/2407.19487)。它评测用的是 </w:t>
+      </w:r>
+      <w:proofErr w:type="spellStart"/>
+      <w:r>
+        <w:rPr>
+          <w:lang w:eastAsia="zh-CN"/>
+        </w:rPr>
+        <w:t>CrossCodeEval</w:t>
+      </w:r>
+      <w:proofErr w:type="spellEnd"/>
+      <w:r>
+        <w:rPr>
+          <w:lang w:eastAsia="zh-CN"/>
+        </w:rPr>
+        <w:t xml:space="preserve"> 和 </w:t>
+      </w:r>
+      <w:proofErr w:type="spellStart"/>
+      <w:r>
+        <w:rPr>
+          <w:lang w:eastAsia="zh-CN"/>
+        </w:rPr>
+        <w:t>RepoEval</w:t>
+      </w:r>
+      <w:proofErr w:type="spellEnd"/>
+      <w:r>
+        <w:rPr>
+          <w:lang w:eastAsia="zh-CN"/>
+        </w:rPr>
+        <w:t xml:space="preserve">，其中 </w:t>
+      </w:r>
+      <w:proofErr w:type="spellStart"/>
+      <w:r>
+        <w:rPr>
+          <w:lang w:eastAsia="zh-CN"/>
+        </w:rPr>
+        <w:t>CrossCodeEval</w:t>
+      </w:r>
+      <w:proofErr w:type="spellEnd"/>
+      <w:r>
+        <w:rPr>
+          <w:lang w:eastAsia="zh-CN"/>
+        </w:rPr>
+        <w:t xml:space="preserve"> 是 1k</w:t>
+      </w:r>
+    </w:p>
+    <w:p>
+      <w:pPr>
+        <w:spacing w:line="360" w:lineRule="auto"/>
+        <w:rPr>
+          <w:lang w:eastAsia="zh-CN"/>
+        </w:rPr>
+      </w:pPr>
+      <w:r>
+        <w:rPr>
+          <w:lang w:eastAsia="zh-CN"/>
+        </w:rPr>
+        <w:t xml:space="preserve">    </w:t>
+      </w:r>
+      <w:proofErr w:type="gramStart"/>
+      <w:r>
+        <w:rPr>
+          <w:lang w:eastAsia="zh-CN"/>
+        </w:rPr>
+        <w:t>个</w:t>
+      </w:r>
+      <w:proofErr w:type="gramEnd"/>
+      <w:r>
+        <w:rPr>
+          <w:lang w:eastAsia="zh-CN"/>
+        </w:rPr>
+        <w:t>仓库、1 万个样本，覆盖 Python、Java、TypeScript、C# 四种语言，专门</w:t>
+      </w:r>
+      <w:proofErr w:type="gramStart"/>
+      <w:r>
+        <w:rPr>
+          <w:lang w:eastAsia="zh-CN"/>
+        </w:rPr>
+        <w:t>测跨文件</w:t>
+      </w:r>
+      <w:proofErr w:type="gramEnd"/>
+      <w:r>
+        <w:rPr>
+          <w:lang w:eastAsia="zh-CN"/>
+        </w:rPr>
+        <w:t>上下文检索。</w:t>
+      </w:r>
+    </w:p>
+    <w:p>
+      <w:pPr>
+        <w:spacing w:line="360" w:lineRule="auto"/>
+        <w:rPr>
+          <w:lang w:eastAsia="zh-CN"/>
+        </w:rPr>
+      </w:pPr>
+    </w:p>
+    <w:p>
+      <w:pPr>
+        <w:spacing w:line="360" w:lineRule="auto"/>
+        <w:rPr>
+          <w:lang w:eastAsia="zh-CN"/>
+        </w:rPr>
+      </w:pPr>
+      <w:r>
+        <w:rPr>
+          <w:lang w:eastAsia="zh-CN"/>
+        </w:rPr>
+        <w:t xml:space="preserve">  - </w:t>
+      </w:r>
+      <w:proofErr w:type="spellStart"/>
+      <w:r>
+        <w:rPr>
+          <w:lang w:eastAsia="zh-CN"/>
+        </w:rPr>
+        <w:t>SproutRAG</w:t>
+      </w:r>
+      <w:proofErr w:type="spellEnd"/>
+      <w:r>
+        <w:rPr>
+          <w:lang w:eastAsia="zh-CN"/>
+        </w:rPr>
+        <w:t xml:space="preserve">：GitHub 在 </w:t>
+      </w:r>
+      <w:proofErr w:type="spellStart"/>
+      <w:r>
+        <w:rPr>
+          <w:lang w:eastAsia="zh-CN"/>
+        </w:rPr>
+        <w:t>AmirAbaskohi</w:t>
+      </w:r>
+      <w:proofErr w:type="spellEnd"/>
+      <w:r>
+        <w:rPr>
+          <w:lang w:eastAsia="zh-CN"/>
+        </w:rPr>
+        <w:t>/</w:t>
+      </w:r>
+      <w:proofErr w:type="spellStart"/>
+      <w:r>
+        <w:rPr>
+          <w:lang w:eastAsia="zh-CN"/>
+        </w:rPr>
+        <w:t>SproutRAG</w:t>
+      </w:r>
+      <w:proofErr w:type="spellEnd"/>
+      <w:r>
+        <w:rPr>
+          <w:lang w:eastAsia="zh-CN"/>
+        </w:rPr>
+        <w:t xml:space="preserve"> (https://github.com/AmirAbaskohi/SproutRAG)，论文是 </w:t>
+      </w:r>
+      <w:proofErr w:type="spellStart"/>
+      <w:r>
+        <w:rPr>
+          <w:lang w:eastAsia="zh-CN"/>
+        </w:rPr>
+        <w:t>SproutRAG</w:t>
+      </w:r>
+      <w:proofErr w:type="spellEnd"/>
+    </w:p>
+    <w:p>
+      <w:pPr>
+        <w:spacing w:line="360" w:lineRule="auto"/>
+        <w:rPr>
+          <w:lang w:eastAsia="zh-CN"/>
+        </w:rPr>
+      </w:pPr>
+      <w:r>
+        <w:rPr>
+          <w:lang w:eastAsia="zh-CN"/>
+        </w:rPr>
+        <w:t xml:space="preserve">    (https://arxiv.org/abs/2606.18381)。它是层次化 chunking，实验覆盖 4</w:t>
+      </w:r>
+    </w:p>
+    <w:p>
+      <w:pPr>
+        <w:spacing w:line="360" w:lineRule="auto"/>
+        <w:rPr>
+          <w:lang w:eastAsia="zh-CN"/>
+        </w:rPr>
+      </w:pPr>
+      <w:r>
+        <w:rPr>
+          <w:lang w:eastAsia="zh-CN"/>
+        </w:rPr>
+        <w:t xml:space="preserve">    </w:t>
+      </w:r>
+      <w:proofErr w:type="gramStart"/>
+      <w:r>
+        <w:rPr>
+          <w:lang w:eastAsia="zh-CN"/>
+        </w:rPr>
+        <w:t>个</w:t>
+      </w:r>
+      <w:proofErr w:type="gramEnd"/>
+      <w:r>
+        <w:rPr>
+          <w:lang w:eastAsia="zh-CN"/>
+        </w:rPr>
+        <w:t>基准，摘要里明确说是科学、法律、开放域三类场景，重点是把 sentence-level chunk 组织成更大的语义单元。</w:t>
+      </w:r>
+    </w:p>
+    <w:p>
+      <w:pPr>
+        <w:spacing w:line="360" w:lineRule="auto"/>
+        <w:rPr>
+          <w:lang w:eastAsia="zh-CN"/>
+        </w:rPr>
+      </w:pPr>
+    </w:p>
+    <w:p>
+      <w:pPr>
+        <w:spacing w:line="360" w:lineRule="auto"/>
+        <w:rPr>
+          <w:lang w:eastAsia="zh-CN"/>
+        </w:rPr>
+      </w:pPr>
+      <w:r>
+        <w:rPr>
+          <w:lang w:eastAsia="zh-CN"/>
+        </w:rPr>
+        <w:t xml:space="preserve">  - </w:t>
+      </w:r>
+      <w:proofErr w:type="spellStart"/>
+      <w:r>
+        <w:rPr>
+          <w:lang w:eastAsia="zh-CN"/>
+        </w:rPr>
+        <w:t>HiChunk</w:t>
+      </w:r>
+      <w:proofErr w:type="spellEnd"/>
+      <w:r>
+        <w:rPr>
+          <w:lang w:eastAsia="zh-CN"/>
+        </w:rPr>
+        <w:t xml:space="preserve"> / </w:t>
+      </w:r>
+      <w:proofErr w:type="spellStart"/>
+      <w:r>
+        <w:rPr>
+          <w:lang w:eastAsia="zh-CN"/>
+        </w:rPr>
+        <w:t>HiCBench</w:t>
+      </w:r>
+      <w:proofErr w:type="spellEnd"/>
+      <w:r>
+        <w:rPr>
+          <w:lang w:eastAsia="zh-CN"/>
+        </w:rPr>
+        <w:t xml:space="preserve">：论文是 </w:t>
+      </w:r>
+      <w:proofErr w:type="spellStart"/>
+      <w:r>
+        <w:rPr>
+          <w:lang w:eastAsia="zh-CN"/>
+        </w:rPr>
+        <w:t>HiChunk</w:t>
+      </w:r>
+      <w:proofErr w:type="spellEnd"/>
+      <w:r>
+        <w:rPr>
+          <w:lang w:eastAsia="zh-CN"/>
+        </w:rPr>
+        <w:t xml:space="preserve"> (https://arxiv.org/abs/2509.11552)。它的关键贡献不是单纯算法，而是</w:t>
+      </w:r>
+    </w:p>
+    <w:p>
+      <w:pPr>
+        <w:spacing w:line="360" w:lineRule="auto"/>
+        <w:rPr>
+          <w:lang w:eastAsia="zh-CN"/>
+        </w:rPr>
+      </w:pPr>
+      <w:r>
+        <w:rPr>
+          <w:lang w:eastAsia="zh-CN"/>
+        </w:rPr>
+        <w:lastRenderedPageBreak/>
+        <w:t xml:space="preserve">    benchmark 设计，</w:t>
+      </w:r>
+      <w:proofErr w:type="spellStart"/>
+      <w:r>
+        <w:rPr>
+          <w:lang w:eastAsia="zh-CN"/>
+        </w:rPr>
+        <w:t>HiCBench</w:t>
+      </w:r>
+      <w:proofErr w:type="spellEnd"/>
+      <w:r>
+        <w:rPr>
+          <w:lang w:eastAsia="zh-CN"/>
+        </w:rPr>
+        <w:t xml:space="preserve"> 包括人工标注的多层 chunk 点、合成的证据密集</w:t>
+      </w:r>
+    </w:p>
+    <w:p>
+      <w:pPr>
+        <w:spacing w:line="360" w:lineRule="auto"/>
+        <w:rPr>
+          <w:lang w:eastAsia="zh-CN"/>
+        </w:rPr>
+      </w:pPr>
+      <w:r>
+        <w:rPr>
+          <w:lang w:eastAsia="zh-CN"/>
+        </w:rPr>
+        <w:t xml:space="preserve">    QA，以及对应证据来源。这个对你做“分段质量闭环评估”很有参考价值。</w:t>
+      </w:r>
+    </w:p>
+    <w:p>
+      <w:pPr>
+        <w:spacing w:line="360" w:lineRule="auto"/>
+        <w:rPr>
+          <w:lang w:eastAsia="zh-CN"/>
+        </w:rPr>
+      </w:pPr>
+    </w:p>
+    <w:p>
+      <w:pPr>
+        <w:spacing w:line="360" w:lineRule="auto"/>
+        <w:rPr>
+          <w:lang w:eastAsia="zh-CN"/>
+        </w:rPr>
+      </w:pPr>
+      <w:r>
+        <w:rPr>
+          <w:lang w:eastAsia="zh-CN"/>
+        </w:rPr>
+        <w:t xml:space="preserve">  - Chunk Twice, Embed Once：论文是 Chunk Twice, Embed Once (https://arxiv.org/abs/2506.17277)。它做的是</w:t>
+      </w:r>
+    </w:p>
+    <w:p>
+      <w:pPr>
+        <w:spacing w:line="360" w:lineRule="auto"/>
+        <w:rPr>
+          <w:lang w:eastAsia="zh-CN"/>
+        </w:rPr>
+      </w:pPr>
+      <w:r>
+        <w:rPr>
+          <w:lang w:eastAsia="zh-CN"/>
+        </w:rPr>
+        <w:t xml:space="preserve">    chemistry 领域的 chunking 研究，提到 25 种 chunking 配置、48 </w:t>
+      </w:r>
+      <w:proofErr w:type="gramStart"/>
+      <w:r>
+        <w:rPr>
+          <w:lang w:eastAsia="zh-CN"/>
+        </w:rPr>
+        <w:t>个</w:t>
+      </w:r>
+      <w:proofErr w:type="gramEnd"/>
+      <w:r>
+        <w:rPr>
+          <w:lang w:eastAsia="zh-CN"/>
+        </w:rPr>
+        <w:t xml:space="preserve"> embedding 模型、3 </w:t>
+      </w:r>
+      <w:proofErr w:type="gramStart"/>
+      <w:r>
+        <w:rPr>
+          <w:lang w:eastAsia="zh-CN"/>
+        </w:rPr>
+        <w:t>个</w:t>
+      </w:r>
+      <w:proofErr w:type="gramEnd"/>
+      <w:r>
+        <w:rPr>
+          <w:lang w:eastAsia="zh-CN"/>
+        </w:rPr>
+        <w:t>化学基准，其中一个明确叫</w:t>
+      </w:r>
+    </w:p>
+    <w:p>
+      <w:pPr>
+        <w:spacing w:line="360" w:lineRule="auto"/>
+        <w:ind w:firstLine="480"/>
+        <w:rPr>
+          <w:lang w:eastAsia="zh-CN"/>
+        </w:rPr>
+      </w:pPr>
+      <w:proofErr w:type="spellStart"/>
+      <w:r>
+        <w:rPr>
+          <w:lang w:eastAsia="zh-CN"/>
+        </w:rPr>
+        <w:t>QuestChemRetrieval</w:t>
+      </w:r>
+      <w:proofErr w:type="spellEnd"/>
+      <w:r>
+        <w:rPr>
+          <w:lang w:eastAsia="zh-CN"/>
+        </w:rPr>
+        <w:t>。这个更偏领域实验设计，不是通用文档分段，但方法论值得参考。</w:t>
+      </w:r>
+    </w:p>
+    <w:p>
+      <w:pPr>
+        <w:spacing w:line="360" w:lineRule="auto"/>
+        <w:rPr>
+          <w:lang w:eastAsia="zh-CN"/>
+        </w:rPr>
+      </w:pPr>
+    </w:p>
+    <w:p>
+      <w:pPr>
+        <w:spacing w:line="360" w:lineRule="auto"/>
+        <w:rPr>
+          <w:lang w:eastAsia="zh-CN"/>
+        </w:rPr>
+      </w:pPr>
+      <w:r>
+        <w:rPr>
+          <w:lang w:eastAsia="zh-CN"/>
+        </w:rPr>
+        <w:t>RGB，是一个中英双语的 RAG benchmark，中文作者团队做的。论文是 Benchmarking Large Language Models in</w:t>
+      </w:r>
+    </w:p>
+    <w:p>
+      <w:pPr>
+        <w:spacing w:line="360" w:lineRule="auto"/>
+        <w:rPr>
+          <w:lang w:eastAsia="zh-CN"/>
+        </w:rPr>
+      </w:pPr>
+      <w:r>
+        <w:rPr>
+          <w:lang w:eastAsia="zh-CN"/>
+        </w:rPr>
+        <w:t xml:space="preserve">    Retrieval-Augmented Generation (https://arxiv.org/abs/2309.01431)。它不是专门做 chunking，但它是中文 RAG</w:t>
+      </w:r>
+    </w:p>
+    <w:p>
+      <w:pPr>
+        <w:spacing w:line="360" w:lineRule="auto"/>
+        <w:rPr>
+          <w:lang w:eastAsia="zh-CN"/>
+        </w:rPr>
+      </w:pPr>
+      <w:r>
+        <w:rPr>
+          <w:lang w:eastAsia="zh-CN"/>
+        </w:rPr>
+        <w:t xml:space="preserve">    </w:t>
+      </w:r>
+      <w:proofErr w:type="gramStart"/>
+      <w:r>
+        <w:rPr>
+          <w:lang w:eastAsia="zh-CN"/>
+        </w:rPr>
+        <w:t>评测里</w:t>
+      </w:r>
+      <w:proofErr w:type="gramEnd"/>
+      <w:r>
+        <w:rPr>
+          <w:lang w:eastAsia="zh-CN"/>
+        </w:rPr>
+        <w:t>很早的一条主线，适合拿来对照“分段是否影响下游检索/生成”。</w:t>
+      </w:r>
+    </w:p>
+    <w:p>
+      <w:pPr>
+        <w:spacing w:line="360" w:lineRule="auto"/>
+        <w:rPr>
+          <w:lang w:eastAsia="zh-CN"/>
+        </w:rPr>
+      </w:pPr>
+    </w:p>
+    <w:p>
+      <w:pPr>
+        <w:spacing w:line="360" w:lineRule="auto"/>
+        <w:rPr>
+          <w:lang w:eastAsia="zh-CN"/>
+        </w:rPr>
+      </w:pPr>
+      <w:r>
+        <w:rPr>
+          <w:lang w:eastAsia="zh-CN"/>
+        </w:rPr>
+        <w:t xml:space="preserve">  - CRUD-RAG，是中文 RAG benchmark，论文是 CRUD-RAG: A Comprehensive Chinese Benchmark for Retrieval-Augmented</w:t>
+      </w:r>
+    </w:p>
+    <w:p>
+      <w:pPr>
+        <w:spacing w:line="360" w:lineRule="auto"/>
+        <w:rPr>
+          <w:lang w:eastAsia="zh-CN"/>
+        </w:rPr>
+      </w:pPr>
+      <w:r>
+        <w:rPr>
+          <w:lang w:eastAsia="zh-CN"/>
+        </w:rPr>
+        <w:t xml:space="preserve">    Generation of Large Language Models (https://arxiv.org/abs/2401.17043)。它按 Create / Read / Update / Delete</w:t>
+      </w:r>
+    </w:p>
+    <w:p>
+      <w:pPr>
+        <w:spacing w:line="360" w:lineRule="auto"/>
+        <w:rPr>
+          <w:lang w:eastAsia="zh-CN"/>
+        </w:rPr>
+      </w:pPr>
+      <w:r>
+        <w:rPr>
+          <w:lang w:eastAsia="zh-CN"/>
+        </w:rPr>
+        <w:t xml:space="preserve">    四类任务构造数据集，更接近你这种“分段 + 检索 + 生成”的整体评测思路。</w:t>
+      </w:r>
+    </w:p>
+    <w:p>
+      <w:pPr>
+        <w:spacing w:line="360" w:lineRule="auto"/>
+        <w:rPr>
+          <w:lang w:eastAsia="zh-CN"/>
+        </w:rPr>
+      </w:pPr>
+    </w:p>
+    <w:p>
+      <w:pPr>
+        <w:spacing w:line="360" w:lineRule="auto"/>
+        <w:rPr>
+          <w:lang w:eastAsia="zh-CN"/>
+        </w:rPr>
+      </w:pPr>
+      <w:r>
+        <w:rPr>
+          <w:lang w:eastAsia="zh-CN"/>
+        </w:rPr>
+        <w:lastRenderedPageBreak/>
+        <w:t xml:space="preserve">  - </w:t>
+      </w:r>
+      <w:proofErr w:type="spellStart"/>
+      <w:r>
+        <w:rPr>
+          <w:lang w:eastAsia="zh-CN"/>
+        </w:rPr>
+        <w:t>DomainRAG</w:t>
+      </w:r>
+      <w:proofErr w:type="spellEnd"/>
+      <w:r>
+        <w:rPr>
+          <w:lang w:eastAsia="zh-CN"/>
+        </w:rPr>
+        <w:t xml:space="preserve">，也是中文 benchmark，论文是 </w:t>
+      </w:r>
+      <w:proofErr w:type="spellStart"/>
+      <w:r>
+        <w:rPr>
+          <w:lang w:eastAsia="zh-CN"/>
+        </w:rPr>
+        <w:t>DomainRAG</w:t>
+      </w:r>
+      <w:proofErr w:type="spellEnd"/>
+      <w:r>
+        <w:rPr>
+          <w:lang w:eastAsia="zh-CN"/>
+        </w:rPr>
+        <w:t>: A Chinese Benchmark for Evaluating Domain-specific</w:t>
+      </w:r>
+    </w:p>
+    <w:p>
+      <w:pPr>
+        <w:spacing w:line="360" w:lineRule="auto"/>
+        <w:rPr>
+          <w:lang w:eastAsia="zh-CN"/>
+        </w:rPr>
+      </w:pPr>
+      <w:r>
+        <w:rPr>
+          <w:lang w:eastAsia="zh-CN"/>
+        </w:rPr>
+        <w:t xml:space="preserve">    Retrieval-Augmented Generation</w:t>
+      </w:r>
+    </w:p>
+    <w:p>
+      <w:pPr>
+        <w:spacing w:line="360" w:lineRule="auto"/>
+        <w:rPr>
+          <w:lang w:eastAsia="zh-CN"/>
+        </w:rPr>
+      </w:pPr>
+      <w:r>
+        <w:rPr>
+          <w:lang w:eastAsia="zh-CN"/>
+        </w:rPr>
+        <w:t xml:space="preserve">    (https://arxiv.org/abs/2406.05654)。它强调结构信息、多文档交互、时效性和上下文对话，适合看中文领域文档场景。</w:t>
+      </w:r>
+    </w:p>
+    <w:p>
+      <w:pPr>
+        <w:spacing w:line="360" w:lineRule="auto"/>
+        <w:rPr>
+          <w:lang w:eastAsia="zh-CN"/>
+        </w:rPr>
+      </w:pPr>
+    </w:p>
+    <w:p>
+      <w:pPr>
+        <w:spacing w:line="360" w:lineRule="auto"/>
+        <w:rPr>
+          <w:lang w:eastAsia="zh-CN"/>
+        </w:rPr>
+      </w:pPr>
+      <w:r>
+        <w:rPr>
+          <w:lang w:eastAsia="zh-CN"/>
+        </w:rPr>
+        <w:t xml:space="preserve">  - </w:t>
+      </w:r>
+      <w:proofErr w:type="spellStart"/>
+      <w:r>
+        <w:rPr>
+          <w:lang w:eastAsia="zh-CN"/>
+        </w:rPr>
+        <w:t>MinerU</w:t>
+      </w:r>
+      <w:proofErr w:type="spellEnd"/>
+      <w:r>
+        <w:rPr>
+          <w:lang w:eastAsia="zh-CN"/>
+        </w:rPr>
+        <w:t>，这是上海 AI Lab/</w:t>
+      </w:r>
+      <w:proofErr w:type="spellStart"/>
+      <w:r>
+        <w:rPr>
+          <w:lang w:eastAsia="zh-CN"/>
+        </w:rPr>
+        <w:t>OpenDataLab</w:t>
+      </w:r>
+      <w:proofErr w:type="spellEnd"/>
+      <w:r>
+        <w:rPr>
+          <w:lang w:eastAsia="zh-CN"/>
+        </w:rPr>
+        <w:t xml:space="preserve"> 的开源文档解析项目，GitHub 在 </w:t>
+      </w:r>
+      <w:proofErr w:type="spellStart"/>
+      <w:r>
+        <w:rPr>
+          <w:lang w:eastAsia="zh-CN"/>
+        </w:rPr>
+        <w:t>opendatalab</w:t>
+      </w:r>
+      <w:proofErr w:type="spellEnd"/>
+      <w:r>
+        <w:rPr>
+          <w:lang w:eastAsia="zh-CN"/>
+        </w:rPr>
+        <w:t>/</w:t>
+      </w:r>
+      <w:proofErr w:type="spellStart"/>
+      <w:r>
+        <w:rPr>
+          <w:lang w:eastAsia="zh-CN"/>
+        </w:rPr>
+        <w:t>MinerU</w:t>
+      </w:r>
+      <w:proofErr w:type="spellEnd"/>
+    </w:p>
+    <w:p>
+      <w:pPr>
+        <w:spacing w:line="360" w:lineRule="auto"/>
+        <w:rPr>
+          <w:lang w:eastAsia="zh-CN"/>
+        </w:rPr>
+      </w:pPr>
+      <w:r>
+        <w:rPr>
+          <w:lang w:eastAsia="zh-CN"/>
+        </w:rPr>
+        <w:t xml:space="preserve">    (https://github.com/opendatalab/MinerU)，论文是 </w:t>
+      </w:r>
+      <w:proofErr w:type="spellStart"/>
+      <w:r>
+        <w:rPr>
+          <w:lang w:eastAsia="zh-CN"/>
+        </w:rPr>
+        <w:t>MinerU</w:t>
+      </w:r>
+      <w:proofErr w:type="spellEnd"/>
+      <w:r>
+        <w:rPr>
+          <w:lang w:eastAsia="zh-CN"/>
+        </w:rPr>
+        <w:t>: An Open-Source Solution for Precise Document Content</w:t>
+      </w:r>
+    </w:p>
+    <w:p>
+      <w:pPr>
+        <w:spacing w:line="360" w:lineRule="auto"/>
+        <w:rPr>
+          <w:lang w:eastAsia="zh-CN"/>
+        </w:rPr>
+      </w:pPr>
+      <w:r>
+        <w:rPr>
+          <w:lang w:eastAsia="zh-CN"/>
+        </w:rPr>
+        <w:t xml:space="preserve">    Extraction (https://arxiv.org/abs/2409.18839)。它不直接做 chunking</w:t>
+      </w:r>
+    </w:p>
+    <w:p>
+      <w:pPr>
+        <w:spacing w:line="360" w:lineRule="auto"/>
+        <w:rPr>
+          <w:lang w:eastAsia="zh-CN"/>
+        </w:rPr>
+      </w:pPr>
+      <w:r>
+        <w:rPr>
+          <w:lang w:eastAsia="zh-CN"/>
+        </w:rPr>
+        <w:t xml:space="preserve">    研究，但它做的是你这类系统最前面的“文档结构提取”，对标题层级、表格、公式、页内结构的恢复</w:t>
+      </w:r>
+      <w:proofErr w:type="gramStart"/>
+      <w:r>
+        <w:rPr>
+          <w:lang w:eastAsia="zh-CN"/>
+        </w:rPr>
+        <w:t>很</w:t>
+      </w:r>
+      <w:proofErr w:type="gramEnd"/>
+      <w:r>
+        <w:rPr>
+          <w:lang w:eastAsia="zh-CN"/>
+        </w:rPr>
+        <w:t>关键。</w:t>
+      </w:r>
+    </w:p>
+    <w:p>
+      <w:pPr>
+        <w:spacing w:line="360" w:lineRule="auto"/>
+        <w:rPr>
+          <w:lang w:eastAsia="zh-CN"/>
+        </w:rPr>
+      </w:pPr>
+    </w:p>
+    <w:p>
+      <w:pPr>
+        <w:spacing w:line="360" w:lineRule="auto"/>
+        <w:rPr>
+          <w:lang w:eastAsia="zh-CN"/>
+        </w:rPr>
+      </w:pPr>
+      <w:r>
+        <w:rPr>
+          <w:lang w:eastAsia="zh-CN"/>
+        </w:rPr>
+        <w:t xml:space="preserve">  - </w:t>
+      </w:r>
+      <w:proofErr w:type="spellStart"/>
+      <w:r>
+        <w:rPr>
+          <w:lang w:eastAsia="zh-CN"/>
+        </w:rPr>
+        <w:t>MinerU</w:t>
+      </w:r>
+      <w:proofErr w:type="spellEnd"/>
+      <w:r>
+        <w:rPr>
+          <w:lang w:eastAsia="zh-CN"/>
+        </w:rPr>
+        <w:t xml:space="preserve">-Popo，更进一步做结构化文档后处理，论文是 </w:t>
+      </w:r>
+      <w:proofErr w:type="spellStart"/>
+      <w:r>
+        <w:rPr>
+          <w:lang w:eastAsia="zh-CN"/>
+        </w:rPr>
+        <w:t>MinerU</w:t>
+      </w:r>
+      <w:proofErr w:type="spellEnd"/>
+      <w:r>
+        <w:rPr>
+          <w:lang w:eastAsia="zh-CN"/>
+        </w:rPr>
+        <w:t>-Popo: Universal Post-Processing Model for Structured</w:t>
+      </w:r>
+    </w:p>
+    <w:p>
+      <w:pPr>
+        <w:spacing w:line="360" w:lineRule="auto"/>
+        <w:rPr>
+          <w:lang w:eastAsia="zh-CN"/>
+        </w:rPr>
+      </w:pPr>
+      <w:r>
+        <w:rPr>
+          <w:lang w:eastAsia="zh-CN"/>
+        </w:rPr>
+        <w:t xml:space="preserve">    Document Parsing (https://arxiv.org/abs/2605.24973)。里面明确提到 title hierarchy reconstruction、dynamic</w:t>
+      </w:r>
+    </w:p>
+    <w:p>
+      <w:pPr>
+        <w:spacing w:line="360" w:lineRule="auto"/>
+        <w:rPr>
+          <w:lang w:eastAsia="zh-CN"/>
+        </w:rPr>
+      </w:pPr>
+      <w:r>
+        <w:rPr>
+          <w:lang w:eastAsia="zh-CN"/>
+        </w:rPr>
+        <w:t xml:space="preserve">    chunking with overlap-based synchronization、node chunking and summaries，这就已经很接近你现在做的方向了。</w:t>
+      </w:r>
+    </w:p>
+    <w:p>
+      <w:pPr>
+        <w:spacing w:line="360" w:lineRule="auto"/>
+        <w:rPr>
+          <w:lang w:eastAsia="zh-CN"/>
+        </w:rPr>
+      </w:pPr>
+    </w:p>
+    <w:p>
+      <w:pPr>
+        <w:spacing w:line="360" w:lineRule="auto"/>
+        <w:rPr>
+          <w:lang w:eastAsia="zh-CN"/>
+        </w:rPr>
+      </w:pPr>
+      <w:r>
+        <w:rPr>
+          <w:lang w:eastAsia="zh-CN"/>
+        </w:rPr>
+        <w:t xml:space="preserve">  - </w:t>
+      </w:r>
+      <w:proofErr w:type="spellStart"/>
+      <w:r>
+        <w:rPr>
+          <w:lang w:eastAsia="zh-CN"/>
+        </w:rPr>
+        <w:t>QChunker</w:t>
+      </w:r>
+      <w:proofErr w:type="spellEnd"/>
+      <w:r>
+        <w:rPr>
+          <w:lang w:eastAsia="zh-CN"/>
+        </w:rPr>
+        <w:t xml:space="preserve">，论文是 </w:t>
+      </w:r>
+      <w:proofErr w:type="spellStart"/>
+      <w:r>
+        <w:rPr>
+          <w:lang w:eastAsia="zh-CN"/>
+        </w:rPr>
+        <w:t>QChunker</w:t>
+      </w:r>
+      <w:proofErr w:type="spellEnd"/>
+      <w:r>
+        <w:rPr>
+          <w:lang w:eastAsia="zh-CN"/>
+        </w:rPr>
+        <w:t>: Learning Question-Aware Text Chunking for Domain RAG via Multi-Agent Debate</w:t>
+      </w:r>
+    </w:p>
+    <w:p>
+      <w:pPr>
+        <w:spacing w:line="360" w:lineRule="auto"/>
+        <w:rPr>
+          <w:lang w:eastAsia="zh-CN"/>
+        </w:rPr>
+      </w:pPr>
+      <w:r>
+        <w:rPr>
+          <w:lang w:eastAsia="zh-CN"/>
+        </w:rPr>
+        <w:lastRenderedPageBreak/>
+        <w:t xml:space="preserve">    (https://arxiv.org/abs/2603.11650)。这是我这轮里最贴近“智能分段”本身的一篇中文作者工作，核心是 question-aware</w:t>
+      </w:r>
+    </w:p>
+    <w:p>
+      <w:pPr>
+        <w:spacing w:line="360" w:lineRule="auto"/>
+        <w:rPr>
+          <w:lang w:eastAsia="zh-CN"/>
+        </w:rPr>
+      </w:pPr>
+      <w:r>
+        <w:rPr>
+          <w:lang w:eastAsia="zh-CN"/>
+        </w:rPr>
+        <w:t xml:space="preserve">    chunking，还构造了 45K 数据集，并提出 </w:t>
+      </w:r>
+      <w:proofErr w:type="spellStart"/>
+      <w:r>
+        <w:rPr>
+          <w:lang w:eastAsia="zh-CN"/>
+        </w:rPr>
+        <w:t>ChunkScore</w:t>
+      </w:r>
+      <w:proofErr w:type="spellEnd"/>
+      <w:r>
+        <w:rPr>
+          <w:lang w:eastAsia="zh-CN"/>
+        </w:rPr>
+        <w:t xml:space="preserve"> 做直接 chunk 评估。只是我这次没有在公开搜索里</w:t>
+      </w:r>
+      <w:proofErr w:type="gramStart"/>
+      <w:r>
+        <w:rPr>
+          <w:lang w:eastAsia="zh-CN"/>
+        </w:rPr>
+        <w:t>稳定检</w:t>
+      </w:r>
+      <w:proofErr w:type="gramEnd"/>
+      <w:r>
+        <w:rPr>
+          <w:lang w:eastAsia="zh-CN"/>
+        </w:rPr>
+        <w:t>到它的</w:t>
+      </w:r>
+    </w:p>
+    <w:p>
+      <w:pPr>
+        <w:spacing w:line="360" w:lineRule="auto"/>
+        <w:rPr>
+          <w:rFonts w:hint="eastAsia"/>
+          <w:lang w:eastAsia="zh-CN"/>
+        </w:rPr>
+      </w:pPr>
+      <w:r>
+        <w:rPr>
+          <w:lang w:eastAsia="zh-CN"/>
+        </w:rPr>
+        <w:t xml:space="preserve">    GitHub 仓库链接，所以这里只能先确认论文和数据集信息。</w:t>
       </w:r>
     </w:p>
     <w:sectPr>
-      <w:headerReference w:type="even" r:id="rId8"/>
-      <w:headerReference w:type="default" r:id="rId9"/>
-      <w:footerReference w:type="even" r:id="rId10"/>
-      <w:footerReference w:type="default" r:id="rId11"/>
-      <w:headerReference w:type="first" r:id="rId12"/>
-      <w:footerReference w:type="first" r:id="rId13"/>
+      <w:footerReference w:type="default" r:id="rId9"/>
       <w:pgSz w:w="12240" w:h="15840"/>
       <w:pgMar w:top="1304" w:right="1417" w:bottom="1304" w:left="1417" w:header="720" w:footer="720" w:gutter="0"/>
       <w:cols w:space="720"/>
@@ -10573,16 +11742,6 @@
 </file>
 
 <file path=word/footer1.xml><?xml version="1.0" encoding="utf-8"?>
-<w:ftr xmlns:wpc="http://schemas.microsoft.com/office/word/2010/wordprocessingCanvas" xmlns:cx="http://schemas.microsoft.com/office/drawing/2014/chartex" xmlns:cx1="http://schemas.microsoft.com/office/drawing/2015/9/8/chartex" xmlns:cx2="http://schemas.microsoft.com/office/drawing/2015/10/21/chartex" xmlns:cx3="http://schemas.microsoft.com/office/drawing/2016/5/9/chartex" xmlns:cx4="http://schemas.microsoft.com/office/drawing/2016/5/10/chartex" xmlns:cx5="http://schemas.microsoft.com/office/drawing/2016/5/11/chartex" xmlns:cx6="http://schemas.microsoft.com/office/drawing/2016/5/12/chartex" xmlns:cx7="http://schemas.microsoft.com/office/drawing/2016/5/13/chartex" xmlns:cx8="http://schemas.microsoft.com/office/drawing/2016/5/14/chartex" xmlns:mc="http://schemas.openxmlformats.org/markup-compatibility/2006" xmlns:aink="http://schemas.microsoft.com/office/drawing/2016/ink" xmlns:am3d="http://schemas.microsoft.com/office/drawing/2017/model3d" xmlns:o="urn:schemas-microsoft-com:office:office" xmlns:oel="http://schemas.microsoft.com/office/2019/extlst" xmlns:r="http://schemas.openxmlformats.org/officeDocument/2006/relationships" xmlns:m="http://schemas.openxmlformats.org/officeDocument/2006/math" xmlns:v="urn:schemas-microsoft-com:vml" xmlns:wp14="http://schemas.microsoft.com/office/word/2010/wordprocessingDrawing" xmlns:wp="http://schemas.openxmlformats.org/drawingml/2006/wordprocessingDrawing" xmlns:w10="urn:schemas-microsoft-com:office:word" xmlns:w="http://schemas.openxmlformats.org/wordprocessingml/2006/main" xmlns:w14="http://schemas.microsoft.com/office/word/2010/wordml" xmlns:w15="http://schemas.microsoft.com/office/word/2012/wordml" xmlns:w16cex="http://schemas.microsoft.com/office/word/2018/wordml/cex" xmlns:w16cid="http://schemas.microsoft.com/office/word/2016/wordml/cid" xmlns:w16="http://schemas.microsoft.com/office/word/2018/wordml" xmlns:w16du="http://schemas.microsoft.com/office/word/2023/wordml/word16du" xmlns:w16sdtdh="http://schemas.microsoft.com/office/word/2020/wordml/sdtdatahash" xmlns:w16sdtfl="http://schemas.microsoft.com/office/word/2024/wordml/sdtformatlock" xmlns:w16se="http://schemas.microsoft.com/office/word/2015/wordml/symex" xmlns:wpg="http://schemas.microsoft.com/office/word/2010/wordprocessingGroup" xmlns:wpi="http://schemas.microsoft.com/office/word/2010/wordprocessingInk" xmlns:wne="http://schemas.microsoft.com/office/word/2006/wordml" xmlns:wps="http://schemas.microsoft.com/office/word/2010/wordprocessingShape" mc:Ignorable="w14 w15 w16se w16cid w16 w16cex w16sdtdh w16sdtfl w16du wp14">
-  <w:p>
-    <w:pPr>
-      <w:pStyle w:val="a7"/>
-    </w:pPr>
-  </w:p>
-</w:ftr>
-</file>
-
-<file path=word/footer2.xml><?xml version="1.0" encoding="utf-8"?>
 <w:ftr xmlns:wpc="http://schemas.microsoft.com/office/word/2010/wordprocessingCanvas" xmlns:cx="http://schemas.microsoft.com/office/drawing/2014/chartex" xmlns:cx1="http://schemas.microsoft.com/office/drawing/2015/9/8/chartex" xmlns:cx2="http://schemas.microsoft.com/office/drawing/2015/10/21/chartex" xmlns:cx3="http://schemas.microsoft.com/office/drawing/2016/5/9/chartex" xmlns:cx4="http://schemas.microsoft.com/office/drawing/2016/5/10/chartex" xmlns:cx5="http://schemas.microsoft.com/office/drawing/2016/5/11/chartex" xmlns:cx6="http://schemas.microsoft.com/office/drawing/2016/5/12/chartex" xmlns:cx7="http://schemas.microsoft.com/office/drawing/2016/5/13/chartex" xmlns:cx8="http://schemas.microsoft.com/office/drawing/2016/5/14/chartex" xmlns:mc="http://schemas.openxmlformats.org/markup-compatibility/2006" xmlns:aink="http://schemas.microsoft.com/office/drawing/2016/ink" xmlns:am3d="http://schemas.microsoft.com/office/drawing/2017/model3d" xmlns:o="urn:schemas-microsoft-com:office:office" xmlns:oel="http://schemas.microsoft.com/office/2019/extlst" xmlns:r="http://schemas.openxmlformats.org/officeDocument/2006/relationships" xmlns:m="http://schemas.openxmlformats.org/officeDocument/2006/math" xmlns:v="urn:schemas-microsoft-com:vml" xmlns:wp14="http://schemas.microsoft.com/office/word/2010/wordprocessingDrawing" xmlns:wp="http://schemas.openxmlformats.org/drawingml/2006/wordprocessingDrawing" xmlns:w10="urn:schemas-microsoft-com:office:word" xmlns:w="http://schemas.openxmlformats.org/wordprocessingml/2006/main" xmlns:w14="http://schemas.microsoft.com/office/word/2010/wordml" xmlns:w15="http://schemas.microsoft.com/office/word/2012/wordml" xmlns:w16cex="http://schemas.microsoft.com/office/word/2018/wordml/cex" xmlns:w16cid="http://schemas.microsoft.com/office/word/2016/wordml/cid" xmlns:w16="http://schemas.microsoft.com/office/word/2018/wordml" xmlns:w16du="http://schemas.microsoft.com/office/word/2023/wordml/word16du" xmlns:w16sdtdh="http://schemas.microsoft.com/office/word/2020/wordml/sdtdatahash" xmlns:w16sdtfl="http://schemas.microsoft.com/office/word/2024/wordml/sdtformatlock" xmlns:w16se="http://schemas.microsoft.com/office/word/2015/wordml/symex" xmlns:wpg="http://schemas.microsoft.com/office/word/2010/wordprocessingGroup" xmlns:wpi="http://schemas.microsoft.com/office/word/2010/wordprocessingInk" xmlns:wne="http://schemas.microsoft.com/office/word/2006/wordml" xmlns:wps="http://schemas.microsoft.com/office/word/2010/wordprocessingShape" mc:Ignorable="w14 w15 w16se w16cid w16 w16cex w16sdtdh w16sdtfl w16du wp14">
   <w:sdt>
     <w:sdtPr>
@@ -10627,16 +11786,6 @@
 </w:ftr>
 </file>
 
-<file path=word/footer3.xml><?xml version="1.0" encoding="utf-8"?>
-<w:ftr xmlns:wpc="http://schemas.microsoft.com/office/word/2010/wordprocessingCanvas" xmlns:cx="http://schemas.microsoft.com/office/drawing/2014/chartex" xmlns:cx1="http://schemas.microsoft.com/office/drawing/2015/9/8/chartex" xmlns:cx2="http://schemas.microsoft.com/office/drawing/2015/10/21/chartex" xmlns:cx3="http://schemas.microsoft.com/office/drawing/2016/5/9/chartex" xmlns:cx4="http://schemas.microsoft.com/office/drawing/2016/5/10/chartex" xmlns:cx5="http://schemas.microsoft.com/office/drawing/2016/5/11/chartex" xmlns:cx6="http://schemas.microsoft.com/office/drawing/2016/5/12/chartex" xmlns:cx7="http://schemas.microsoft.com/office/drawing/2016/5/13/chartex" xmlns:cx8="http://schemas.microsoft.com/office/drawing/2016/5/14/chartex" xmlns:mc="http://schemas.openxmlformats.org/markup-compatibility/2006" xmlns:aink="http://schemas.microsoft.com/office/drawing/2016/ink" xmlns:am3d="http://schemas.microsoft.com/office/drawing/2017/model3d" xmlns:o="urn:schemas-microsoft-com:office:office" xmlns:oel="http://schemas.microsoft.com/office/2019/extlst" xmlns:r="http://schemas.openxmlformats.org/officeDocument/2006/relationships" xmlns:m="http://schemas.openxmlformats.org/officeDocument/2006/math" xmlns:v="urn:schemas-microsoft-com:vml" xmlns:wp14="http://schemas.microsoft.com/office/word/2010/wordprocessingDrawing" xmlns:wp="http://schemas.openxmlformats.org/drawingml/2006/wordprocessingDrawing" xmlns:w10="urn:schemas-microsoft-com:office:word" xmlns:w="http://schemas.openxmlformats.org/wordprocessingml/2006/main" xmlns:w14="http://schemas.microsoft.com/office/word/2010/wordml" xmlns:w15="http://schemas.microsoft.com/office/word/2012/wordml" xmlns:w16cex="http://schemas.microsoft.com/office/word/2018/wordml/cex" xmlns:w16cid="http://schemas.microsoft.com/office/word/2016/wordml/cid" xmlns:w16="http://schemas.microsoft.com/office/word/2018/wordml" xmlns:w16du="http://schemas.microsoft.com/office/word/2023/wordml/word16du" xmlns:w16sdtdh="http://schemas.microsoft.com/office/word/2020/wordml/sdtdatahash" xmlns:w16sdtfl="http://schemas.microsoft.com/office/word/2024/wordml/sdtformatlock" xmlns:w16se="http://schemas.microsoft.com/office/word/2015/wordml/symex" xmlns:wpg="http://schemas.microsoft.com/office/word/2010/wordprocessingGroup" xmlns:wpi="http://schemas.microsoft.com/office/word/2010/wordprocessingInk" xmlns:wne="http://schemas.microsoft.com/office/word/2006/wordml" xmlns:wps="http://schemas.microsoft.com/office/word/2010/wordprocessingShape" mc:Ignorable="w14 w15 w16se w16cid w16 w16cex w16sdtdh w16sdtfl w16du wp14">
-  <w:p>
-    <w:pPr>
-      <w:pStyle w:val="a7"/>
-    </w:pPr>
-  </w:p>
-</w:ftr>
-</file>
-
 <file path=word/footnotes.xml><?xml version="1.0" encoding="utf-8"?>
 <w:footnotes xmlns:wpc="http://schemas.microsoft.com/office/word/2010/wordprocessingCanvas" xmlns:cx="http://schemas.microsoft.com/office/drawing/2014/chartex" xmlns:cx1="http://schemas.microsoft.com/office/drawing/2015/9/8/chartex" xmlns:cx2="http://schemas.microsoft.com/office/drawing/2015/10/21/chartex" xmlns:cx3="http://schemas.microsoft.com/office/drawing/2016/5/9/chartex" xmlns:cx4="http://schemas.microsoft.com/office/drawing/2016/5/10/chartex" xmlns:cx5="http://schemas.microsoft.com/office/drawing/2016/5/11/chartex" xmlns:cx6="http://schemas.microsoft.com/office/drawing/2016/5/12/chartex" xmlns:cx7="http://schemas.microsoft.com/office/drawing/2016/5/13/chartex" xmlns:cx8="http://schemas.microsoft.com/office/drawing/2016/5/14/chartex" xmlns:mc="http://schemas.openxmlformats.org/markup-compatibility/2006" xmlns:aink="http://schemas.microsoft.com/office/drawing/2016/ink" xmlns:am3d="http://schemas.microsoft.com/office/drawing/2017/model3d" xmlns:o="urn:schemas-microsoft-com:office:office" xmlns:oel="http://schemas.microsoft.com/office/2019/extlst" xmlns:r="http://schemas.openxmlformats.org/officeDocument/2006/relationships" xmlns:m="http://schemas.openxmlformats.org/officeDocument/2006/math" xmlns:v="urn:schemas-microsoft-com:vml" xmlns:wp14="http://schemas.microsoft.com/office/word/2010/wordprocessingDrawing" xmlns:wp="http://schemas.openxmlformats.org/drawingml/2006/wordprocessingDrawing" xmlns:w10="urn:schemas-microsoft-com:office:word" xmlns:w="http://schemas.openxmlformats.org/wordprocessingml/2006/main" xmlns:w14="http://schemas.microsoft.com/office/word/2010/wordml" xmlns:w15="http://schemas.microsoft.com/office/word/2012/wordml" xmlns:w16cex="http://schemas.microsoft.com/office/word/2018/wordml/cex" xmlns:w16cid="http://schemas.microsoft.com/office/word/2016/wordml/cid" xmlns:w16="http://schemas.microsoft.com/office/word/2018/wordml" xmlns:w16du="http://schemas.microsoft.com/office/word/2023/wordml/word16du" xmlns:w16sdtdh="http://schemas.microsoft.com/office/word/2020/wordml/sdtdatahash" xmlns:w16sdtfl="http://schemas.microsoft.com/office/word/2024/wordml/sdtformatlock" xmlns:w16se="http://schemas.microsoft.com/office/word/2015/wordml/symex" xmlns:wpg="http://schemas.microsoft.com/office/word/2010/wordprocessingGroup" xmlns:wpi="http://schemas.microsoft.com/office/word/2010/wordprocessingInk" xmlns:wne="http://schemas.microsoft.com/office/word/2006/wordml" xmlns:wps="http://schemas.microsoft.com/office/word/2010/wordprocessingShape" mc:Ignorable="w14 w15 w16se w16cid w16 w16cex w16sdtdh w16sdtfl w16du wp14">
   <w:footnote w:type="separator" w:id="-1">
@@ -10660,36 +11809,6 @@
     </w:p>
   </w:footnote>
 </w:footnotes>
-</file>
-
-<file path=word/header1.xml><?xml version="1.0" encoding="utf-8"?>
-<w:hdr xmlns:wpc="http://schemas.microsoft.com/office/word/2010/wordprocessingCanvas" xmlns:cx="http://schemas.microsoft.com/office/drawing/2014/chartex" xmlns:cx1="http://schemas.microsoft.com/office/drawing/2015/9/8/chartex" xmlns:cx2="http://schemas.microsoft.com/office/drawing/2015/10/21/chartex" xmlns:cx3="http://schemas.microsoft.com/office/drawing/2016/5/9/chartex" xmlns:cx4="http://schemas.microsoft.com/office/drawing/2016/5/10/chartex" xmlns:cx5="http://schemas.microsoft.com/office/drawing/2016/5/11/chartex" xmlns:cx6="http://schemas.microsoft.com/office/drawing/2016/5/12/chartex" xmlns:cx7="http://schemas.microsoft.com/office/drawing/2016/5/13/chartex" xmlns:cx8="http://schemas.microsoft.com/office/drawing/2016/5/14/chartex" xmlns:mc="http://schemas.openxmlformats.org/markup-compatibility/2006" xmlns:aink="http://schemas.microsoft.com/office/drawing/2016/ink" xmlns:am3d="http://schemas.microsoft.com/office/drawing/2017/model3d" xmlns:o="urn:schemas-microsoft-com:office:office" xmlns:oel="http://schemas.microsoft.com/office/2019/extlst" xmlns:r="http://schemas.openxmlformats.org/officeDocument/2006/relationships" xmlns:m="http://schemas.openxmlformats.org/officeDocument/2006/math" xmlns:v="urn:schemas-microsoft-com:vml" xmlns:wp14="http://schemas.microsoft.com/office/word/2010/wordprocessingDrawing" xmlns:wp="http://schemas.openxmlformats.org/drawingml/2006/wordprocessingDrawing" xmlns:w10="urn:schemas-microsoft-com:office:word" xmlns:w="http://schemas.openxmlformats.org/wordprocessingml/2006/main" xmlns:w14="http://schemas.microsoft.com/office/word/2010/wordml" xmlns:w15="http://schemas.microsoft.com/office/word/2012/wordml" xmlns:w16cex="http://schemas.microsoft.com/office/word/2018/wordml/cex" xmlns:w16cid="http://schemas.microsoft.com/office/word/2016/wordml/cid" xmlns:w16="http://schemas.microsoft.com/office/word/2018/wordml" xmlns:w16du="http://schemas.microsoft.com/office/word/2023/wordml/word16du" xmlns:w16sdtdh="http://schemas.microsoft.com/office/word/2020/wordml/sdtdatahash" xmlns:w16sdtfl="http://schemas.microsoft.com/office/word/2024/wordml/sdtformatlock" xmlns:w16se="http://schemas.microsoft.com/office/word/2015/wordml/symex" xmlns:wpg="http://schemas.microsoft.com/office/word/2010/wordprocessingGroup" xmlns:wpi="http://schemas.microsoft.com/office/word/2010/wordprocessingInk" xmlns:wne="http://schemas.microsoft.com/office/word/2006/wordml" xmlns:wps="http://schemas.microsoft.com/office/word/2010/wordprocessingShape" mc:Ignorable="w14 w15 w16se w16cid w16 w16cex w16sdtdh w16sdtfl w16du wp14">
-  <w:p>
-    <w:pPr>
-      <w:pStyle w:val="a5"/>
-    </w:pPr>
-  </w:p>
-</w:hdr>
-</file>
-
-<file path=word/header2.xml><?xml version="1.0" encoding="utf-8"?>
-<w:hdr xmlns:wpc="http://schemas.microsoft.com/office/word/2010/wordprocessingCanvas" xmlns:cx="http://schemas.microsoft.com/office/drawing/2014/chartex" xmlns:cx1="http://schemas.microsoft.com/office/drawing/2015/9/8/chartex" xmlns:cx2="http://schemas.microsoft.com/office/drawing/2015/10/21/chartex" xmlns:cx3="http://schemas.microsoft.com/office/drawing/2016/5/9/chartex" xmlns:cx4="http://schemas.microsoft.com/office/drawing/2016/5/10/chartex" xmlns:cx5="http://schemas.microsoft.com/office/drawing/2016/5/11/chartex" xmlns:cx6="http://schemas.microsoft.com/office/drawing/2016/5/12/chartex" xmlns:cx7="http://schemas.microsoft.com/office/drawing/2016/5/13/chartex" xmlns:cx8="http://schemas.microsoft.com/office/drawing/2016/5/14/chartex" xmlns:mc="http://schemas.openxmlformats.org/markup-compatibility/2006" xmlns:aink="http://schemas.microsoft.com/office/drawing/2016/ink" xmlns:am3d="http://schemas.microsoft.com/office/drawing/2017/model3d" xmlns:o="urn:schemas-microsoft-com:office:office" xmlns:oel="http://schemas.microsoft.com/office/2019/extlst" xmlns:r="http://schemas.openxmlformats.org/officeDocument/2006/relationships" xmlns:m="http://schemas.openxmlformats.org/officeDocument/2006/math" xmlns:v="urn:schemas-microsoft-com:vml" xmlns:wp14="http://schemas.microsoft.com/office/word/2010/wordprocessingDrawing" xmlns:wp="http://schemas.openxmlformats.org/drawingml/2006/wordprocessingDrawing" xmlns:w10="urn:schemas-microsoft-com:office:word" xmlns:w="http://schemas.openxmlformats.org/wordprocessingml/2006/main" xmlns:w14="http://schemas.microsoft.com/office/word/2010/wordml" xmlns:w15="http://schemas.microsoft.com/office/word/2012/wordml" xmlns:w16cex="http://schemas.microsoft.com/office/word/2018/wordml/cex" xmlns:w16cid="http://schemas.microsoft.com/office/word/2016/wordml/cid" xmlns:w16="http://schemas.microsoft.com/office/word/2018/wordml" xmlns:w16du="http://schemas.microsoft.com/office/word/2023/wordml/word16du" xmlns:w16sdtdh="http://schemas.microsoft.com/office/word/2020/wordml/sdtdatahash" xmlns:w16sdtfl="http://schemas.microsoft.com/office/word/2024/wordml/sdtformatlock" xmlns:w16se="http://schemas.microsoft.com/office/word/2015/wordml/symex" xmlns:wpg="http://schemas.microsoft.com/office/word/2010/wordprocessingGroup" xmlns:wpi="http://schemas.microsoft.com/office/word/2010/wordprocessingInk" xmlns:wne="http://schemas.microsoft.com/office/word/2006/wordml" xmlns:wps="http://schemas.microsoft.com/office/word/2010/wordprocessingShape" mc:Ignorable="w14 w15 w16se w16cid w16 w16cex w16sdtdh w16sdtfl w16du wp14">
-  <w:p>
-    <w:pPr>
-      <w:pStyle w:val="a5"/>
-    </w:pPr>
-  </w:p>
-</w:hdr>
-</file>
-
-<file path=word/header3.xml><?xml version="1.0" encoding="utf-8"?>
-<w:hdr xmlns:wpc="http://schemas.microsoft.com/office/word/2010/wordprocessingCanvas" xmlns:cx="http://schemas.microsoft.com/office/drawing/2014/chartex" xmlns:cx1="http://schemas.microsoft.com/office/drawing/2015/9/8/chartex" xmlns:cx2="http://schemas.microsoft.com/office/drawing/2015/10/21/chartex" xmlns:cx3="http://schemas.microsoft.com/office/drawing/2016/5/9/chartex" xmlns:cx4="http://schemas.microsoft.com/office/drawing/2016/5/10/chartex" xmlns:cx5="http://schemas.microsoft.com/office/drawing/2016/5/11/chartex" xmlns:cx6="http://schemas.microsoft.com/office/drawing/2016/5/12/chartex" xmlns:cx7="http://schemas.microsoft.com/office/drawing/2016/5/13/chartex" xmlns:cx8="http://schemas.microsoft.com/office/drawing/2016/5/14/chartex" xmlns:mc="http://schemas.openxmlformats.org/markup-compatibility/2006" xmlns:aink="http://schemas.microsoft.com/office/drawing/2016/ink" xmlns:am3d="http://schemas.microsoft.com/office/drawing/2017/model3d" xmlns:o="urn:schemas-microsoft-com:office:office" xmlns:oel="http://schemas.microsoft.com/office/2019/extlst" xmlns:r="http://schemas.openxmlformats.org/officeDocument/2006/relationships" xmlns:m="http://schemas.openxmlformats.org/officeDocument/2006/math" xmlns:v="urn:schemas-microsoft-com:vml" xmlns:wp14="http://schemas.microsoft.com/office/word/2010/wordprocessingDrawing" xmlns:wp="http://schemas.openxmlformats.org/drawingml/2006/wordprocessingDrawing" xmlns:w10="urn:schemas-microsoft-com:office:word" xmlns:w="http://schemas.openxmlformats.org/wordprocessingml/2006/main" xmlns:w14="http://schemas.microsoft.com/office/word/2010/wordml" xmlns:w15="http://schemas.microsoft.com/office/word/2012/wordml" xmlns:w16cex="http://schemas.microsoft.com/office/word/2018/wordml/cex" xmlns:w16cid="http://schemas.microsoft.com/office/word/2016/wordml/cid" xmlns:w16="http://schemas.microsoft.com/office/word/2018/wordml" xmlns:w16du="http://schemas.microsoft.com/office/word/2023/wordml/word16du" xmlns:w16sdtdh="http://schemas.microsoft.com/office/word/2020/wordml/sdtdatahash" xmlns:w16sdtfl="http://schemas.microsoft.com/office/word/2024/wordml/sdtformatlock" xmlns:w16se="http://schemas.microsoft.com/office/word/2015/wordml/symex" xmlns:wpg="http://schemas.microsoft.com/office/word/2010/wordprocessingGroup" xmlns:wpi="http://schemas.microsoft.com/office/word/2010/wordprocessingInk" xmlns:wne="http://schemas.microsoft.com/office/word/2006/wordml" xmlns:wps="http://schemas.microsoft.com/office/word/2010/wordprocessingShape" mc:Ignorable="w14 w15 w16se w16cid w16 w16cex w16sdtdh w16sdtfl w16du wp14">
-  <w:p>
-    <w:pPr>
-      <w:pStyle w:val="a5"/>
-    </w:pPr>
-  </w:p>
-</w:hdr>
 </file>
 
 <file path=word/numbering.xml><?xml version="1.0" encoding="utf-8"?>
@@ -22487,6 +23606,18 @@
       <w:u w:val="single"/>
     </w:rPr>
   </w:style>
+  <w:style w:type="character" w:styleId="affa">
+    <w:name w:val="Unresolved Mention"/>
+    <w:basedOn w:val="a2"/>
+    <w:uiPriority w:val="99"/>
+    <w:semiHidden/>
+    <w:unhideWhenUsed/>
+    <w:rsid w:val="00380A8E"/>
+    <w:rPr>
+      <w:color w:val="605E5C"/>
+      <w:shd w:val="clear" w:color="auto" w:fill="E1DFDD"/>
+    </w:rPr>
+  </w:style>
 </w:styles>
 </file>
 

</xml_diff>